<commit_message>
exp+docs: data leakage and label-noise analyses; chapter 4 sections 4.6-4.7; innovation points
</commit_message>
<xml_diff>
--- a/docs/thesis-ch3-ch4.docx
+++ b/docs/thesis-ch3-ch4.docx
@@ -11804,7 +11804,7 @@
           <w:b/>
           <w:sz w:val="28"/>
         </w:rPr>
-        <w:t>4.6 本章小结</w:t>
+        <w:t>4.6 数据泄露对评估结果的影响</w:t>
       </w:r>
     </w:p>
     <w:p>
@@ -11818,7 +11818,1137 @@
           <w:b w:val="0"/>
           <w:sz w:val="24"/>
         </w:rPr>
-        <w:t>本章从分类效果、统计显著性、校准和选择性预测四个方面对实验结果进行了分析，主要结论如下：</w:t>
+        <w:t>为检验 3.2 节数据清洗的必要性，本文模拟了直接使用公开数据的常见做法：不去重、不处理冲突，在原始训练文件（随机划出 10% 作验证集）上训练 TF-IDF + 逻辑回归和 RoBERTa（3 个种子），在原始 eval_list 的全部 2020 条样本上测试。根据测试样本是否在训练文件中出现过，把测试集分为三组：训练中出现过且有相同标签（seen_same，868 条，占 43%）、训练中出现过但标签不同（seen_diff，229 条）、训练中未出现过（unseen，923 条）。结果见表 4-9。</w:t>
+      </w:r>
+    </w:p>
+    <w:p>
+      <w:pPr>
+        <w:spacing w:line="360" w:lineRule="auto" w:after="0"/>
+        <w:jc w:val="center"/>
+      </w:pPr>
+      <w:r>
+        <w:rPr>
+          <w:rFonts w:ascii="Times New Roman" w:hAnsi="Times New Roman" w:eastAsia="宋体"/>
+          <w:b w:val="0"/>
+          <w:sz w:val="21"/>
+        </w:rPr>
+        <w:t>表 4-9 未清洗数据上训练与测试的结果（Macro-F1，RoBERTa 为 3 个种子均值）</w:t>
+      </w:r>
+    </w:p>
+    <w:tbl>
+      <w:tblPr>
+        <w:tblW w:type="auto" w:w="0"/>
+        <w:tblLook w:firstColumn="1" w:firstRow="1" w:lastColumn="0" w:lastRow="0" w:noHBand="0" w:noVBand="1" w:val="04A0"/>
+        <w:jc w:val="center"/>
+        <w:tblBorders>
+          <w:top w:val="single" w:sz="4"/>
+          <w:left w:val="single" w:sz="4"/>
+          <w:bottom w:val="single" w:sz="4"/>
+          <w:right w:val="single" w:sz="4"/>
+          <w:insideH w:val="single" w:sz="4"/>
+          <w:insideV w:val="single" w:sz="4"/>
+        </w:tblBorders>
+      </w:tblPr>
+      <w:tblGrid>
+        <w:gridCol w:w="1511"/>
+        <w:gridCol w:w="1511"/>
+        <w:gridCol w:w="1511"/>
+        <w:gridCol w:w="1511"/>
+        <w:gridCol w:w="1511"/>
+        <w:gridCol w:w="1511"/>
+      </w:tblGrid>
+      <w:tr>
+        <w:tc>
+          <w:tcPr>
+            <w:tcW w:type="dxa" w:w="1511"/>
+          </w:tcPr>
+          <w:p>
+            <w:pPr>
+              <w:jc w:val="center"/>
+            </w:pPr>
+            <w:r/>
+            <w:r>
+              <w:rPr>
+                <w:rFonts w:ascii="Times New Roman" w:hAnsi="Times New Roman" w:eastAsia="黑体"/>
+                <w:b w:val="0"/>
+                <w:sz w:val="21"/>
+              </w:rPr>
+              <w:t>测试子集</w:t>
+            </w:r>
+          </w:p>
+        </w:tc>
+        <w:tc>
+          <w:tcPr>
+            <w:tcW w:type="dxa" w:w="1511"/>
+          </w:tcPr>
+          <w:p>
+            <w:pPr>
+              <w:jc w:val="center"/>
+            </w:pPr>
+            <w:r/>
+            <w:r>
+              <w:rPr>
+                <w:rFonts w:ascii="Times New Roman" w:hAnsi="Times New Roman" w:eastAsia="黑体"/>
+                <w:b w:val="0"/>
+                <w:sz w:val="21"/>
+              </w:rPr>
+              <w:t>样本数</w:t>
+            </w:r>
+          </w:p>
+        </w:tc>
+        <w:tc>
+          <w:tcPr>
+            <w:tcW w:type="dxa" w:w="1511"/>
+          </w:tcPr>
+          <w:p>
+            <w:pPr>
+              <w:jc w:val="center"/>
+            </w:pPr>
+            <w:r/>
+            <w:r>
+              <w:rPr>
+                <w:rFonts w:ascii="Times New Roman" w:hAnsi="Times New Roman" w:eastAsia="黑体"/>
+                <w:b w:val="0"/>
+                <w:sz w:val="21"/>
+              </w:rPr>
+              <w:t>TF-IDF+LR 准确率</w:t>
+            </w:r>
+          </w:p>
+        </w:tc>
+        <w:tc>
+          <w:tcPr>
+            <w:tcW w:type="dxa" w:w="1511"/>
+          </w:tcPr>
+          <w:p>
+            <w:pPr>
+              <w:jc w:val="center"/>
+            </w:pPr>
+            <w:r/>
+            <w:r>
+              <w:rPr>
+                <w:rFonts w:ascii="Times New Roman" w:hAnsi="Times New Roman" w:eastAsia="黑体"/>
+                <w:b w:val="0"/>
+                <w:sz w:val="21"/>
+              </w:rPr>
+              <w:t>TF-IDF+LR Macro-F1</w:t>
+            </w:r>
+          </w:p>
+        </w:tc>
+        <w:tc>
+          <w:tcPr>
+            <w:tcW w:type="dxa" w:w="1511"/>
+          </w:tcPr>
+          <w:p>
+            <w:pPr>
+              <w:jc w:val="center"/>
+            </w:pPr>
+            <w:r/>
+            <w:r>
+              <w:rPr>
+                <w:rFonts w:ascii="Times New Roman" w:hAnsi="Times New Roman" w:eastAsia="黑体"/>
+                <w:b w:val="0"/>
+                <w:sz w:val="21"/>
+              </w:rPr>
+              <w:t>RoBERTa 准确率</w:t>
+            </w:r>
+          </w:p>
+        </w:tc>
+        <w:tc>
+          <w:tcPr>
+            <w:tcW w:type="dxa" w:w="1511"/>
+          </w:tcPr>
+          <w:p>
+            <w:pPr>
+              <w:jc w:val="center"/>
+            </w:pPr>
+            <w:r/>
+            <w:r>
+              <w:rPr>
+                <w:rFonts w:ascii="Times New Roman" w:hAnsi="Times New Roman" w:eastAsia="黑体"/>
+                <w:b w:val="0"/>
+                <w:sz w:val="21"/>
+              </w:rPr>
+              <w:t>RoBERTa Macro-F1</w:t>
+            </w:r>
+          </w:p>
+        </w:tc>
+      </w:tr>
+      <w:tr>
+        <w:tc>
+          <w:tcPr>
+            <w:tcW w:type="dxa" w:w="1511"/>
+          </w:tcPr>
+          <w:p>
+            <w:r/>
+            <w:r>
+              <w:rPr>
+                <w:rFonts w:ascii="Times New Roman" w:hAnsi="Times New Roman" w:eastAsia="宋体"/>
+                <w:b w:val="0"/>
+                <w:sz w:val="21"/>
+              </w:rPr>
+              <w:t>全部测试集</w:t>
+            </w:r>
+          </w:p>
+        </w:tc>
+        <w:tc>
+          <w:tcPr>
+            <w:tcW w:type="dxa" w:w="1511"/>
+          </w:tcPr>
+          <w:p>
+            <w:r/>
+            <w:r>
+              <w:rPr>
+                <w:rFonts w:ascii="Times New Roman" w:hAnsi="Times New Roman" w:eastAsia="宋体"/>
+                <w:b w:val="0"/>
+                <w:sz w:val="21"/>
+              </w:rPr>
+              <w:t>2020</w:t>
+            </w:r>
+          </w:p>
+        </w:tc>
+        <w:tc>
+          <w:tcPr>
+            <w:tcW w:type="dxa" w:w="1511"/>
+          </w:tcPr>
+          <w:p>
+            <w:r/>
+            <w:r>
+              <w:rPr>
+                <w:rFonts w:ascii="Times New Roman" w:hAnsi="Times New Roman" w:eastAsia="宋体"/>
+                <w:b w:val="0"/>
+                <w:sz w:val="21"/>
+              </w:rPr>
+              <w:t>0.770</w:t>
+            </w:r>
+          </w:p>
+        </w:tc>
+        <w:tc>
+          <w:tcPr>
+            <w:tcW w:type="dxa" w:w="1511"/>
+          </w:tcPr>
+          <w:p>
+            <w:r/>
+            <w:r>
+              <w:rPr>
+                <w:rFonts w:ascii="Times New Roman" w:hAnsi="Times New Roman" w:eastAsia="宋体"/>
+                <w:b w:val="0"/>
+                <w:sz w:val="21"/>
+              </w:rPr>
+              <w:t>0.755</w:t>
+            </w:r>
+          </w:p>
+        </w:tc>
+        <w:tc>
+          <w:tcPr>
+            <w:tcW w:type="dxa" w:w="1511"/>
+          </w:tcPr>
+          <w:p>
+            <w:r/>
+            <w:r>
+              <w:rPr>
+                <w:rFonts w:ascii="Times New Roman" w:hAnsi="Times New Roman" w:eastAsia="宋体"/>
+                <w:b w:val="0"/>
+                <w:sz w:val="21"/>
+              </w:rPr>
+              <w:t>0.788</w:t>
+            </w:r>
+          </w:p>
+        </w:tc>
+        <w:tc>
+          <w:tcPr>
+            <w:tcW w:type="dxa" w:w="1511"/>
+          </w:tcPr>
+          <w:p>
+            <w:r/>
+            <w:r>
+              <w:rPr>
+                <w:rFonts w:ascii="Times New Roman" w:hAnsi="Times New Roman" w:eastAsia="宋体"/>
+                <w:b w:val="0"/>
+                <w:sz w:val="21"/>
+              </w:rPr>
+              <w:t>0.773</w:t>
+            </w:r>
+          </w:p>
+        </w:tc>
+      </w:tr>
+      <w:tr>
+        <w:tc>
+          <w:tcPr>
+            <w:tcW w:type="dxa" w:w="1511"/>
+          </w:tcPr>
+          <w:p>
+            <w:r/>
+            <w:r>
+              <w:rPr>
+                <w:rFonts w:ascii="Times New Roman" w:hAnsi="Times New Roman" w:eastAsia="宋体"/>
+                <w:b w:val="0"/>
+                <w:sz w:val="21"/>
+              </w:rPr>
+              <w:t>见过且标签相同（seen_same）</w:t>
+            </w:r>
+          </w:p>
+        </w:tc>
+        <w:tc>
+          <w:tcPr>
+            <w:tcW w:type="dxa" w:w="1511"/>
+          </w:tcPr>
+          <w:p>
+            <w:r/>
+            <w:r>
+              <w:rPr>
+                <w:rFonts w:ascii="Times New Roman" w:hAnsi="Times New Roman" w:eastAsia="宋体"/>
+                <w:b w:val="0"/>
+                <w:sz w:val="21"/>
+              </w:rPr>
+              <w:t>868</w:t>
+            </w:r>
+          </w:p>
+        </w:tc>
+        <w:tc>
+          <w:tcPr>
+            <w:tcW w:type="dxa" w:w="1511"/>
+          </w:tcPr>
+          <w:p>
+            <w:r/>
+            <w:r>
+              <w:rPr>
+                <w:rFonts w:ascii="Times New Roman" w:hAnsi="Times New Roman" w:eastAsia="宋体"/>
+                <w:b w:val="0"/>
+                <w:sz w:val="21"/>
+              </w:rPr>
+              <w:t>0.968</w:t>
+            </w:r>
+          </w:p>
+        </w:tc>
+        <w:tc>
+          <w:tcPr>
+            <w:tcW w:type="dxa" w:w="1511"/>
+          </w:tcPr>
+          <w:p>
+            <w:r/>
+            <w:r>
+              <w:rPr>
+                <w:rFonts w:ascii="Times New Roman" w:hAnsi="Times New Roman" w:eastAsia="宋体"/>
+                <w:b w:val="0"/>
+                <w:sz w:val="21"/>
+              </w:rPr>
+              <w:t>0.967</w:t>
+            </w:r>
+          </w:p>
+        </w:tc>
+        <w:tc>
+          <w:tcPr>
+            <w:tcW w:type="dxa" w:w="1511"/>
+          </w:tcPr>
+          <w:p>
+            <w:r/>
+            <w:r>
+              <w:rPr>
+                <w:rFonts w:ascii="Times New Roman" w:hAnsi="Times New Roman" w:eastAsia="宋体"/>
+                <w:b w:val="0"/>
+                <w:sz w:val="21"/>
+              </w:rPr>
+              <w:t>0.926</w:t>
+            </w:r>
+          </w:p>
+        </w:tc>
+        <w:tc>
+          <w:tcPr>
+            <w:tcW w:type="dxa" w:w="1511"/>
+          </w:tcPr>
+          <w:p>
+            <w:r/>
+            <w:r>
+              <w:rPr>
+                <w:rFonts w:ascii="Times New Roman" w:hAnsi="Times New Roman" w:eastAsia="宋体"/>
+                <w:b w:val="0"/>
+                <w:sz w:val="21"/>
+              </w:rPr>
+              <w:t>0.923</w:t>
+            </w:r>
+          </w:p>
+        </w:tc>
+      </w:tr>
+      <w:tr>
+        <w:tc>
+          <w:tcPr>
+            <w:tcW w:type="dxa" w:w="1511"/>
+          </w:tcPr>
+          <w:p>
+            <w:r/>
+            <w:r>
+              <w:rPr>
+                <w:rFonts w:ascii="Times New Roman" w:hAnsi="Times New Roman" w:eastAsia="宋体"/>
+                <w:b w:val="0"/>
+                <w:sz w:val="21"/>
+              </w:rPr>
+              <w:t>见过但标签不同（seen_diff）</w:t>
+            </w:r>
+          </w:p>
+        </w:tc>
+        <w:tc>
+          <w:tcPr>
+            <w:tcW w:type="dxa" w:w="1511"/>
+          </w:tcPr>
+          <w:p>
+            <w:r/>
+            <w:r>
+              <w:rPr>
+                <w:rFonts w:ascii="Times New Roman" w:hAnsi="Times New Roman" w:eastAsia="宋体"/>
+                <w:b w:val="0"/>
+                <w:sz w:val="21"/>
+              </w:rPr>
+              <w:t>229</w:t>
+            </w:r>
+          </w:p>
+        </w:tc>
+        <w:tc>
+          <w:tcPr>
+            <w:tcW w:type="dxa" w:w="1511"/>
+          </w:tcPr>
+          <w:p>
+            <w:r/>
+            <w:r>
+              <w:rPr>
+                <w:rFonts w:ascii="Times New Roman" w:hAnsi="Times New Roman" w:eastAsia="宋体"/>
+                <w:b w:val="0"/>
+                <w:sz w:val="21"/>
+              </w:rPr>
+              <w:t>0.052</w:t>
+            </w:r>
+          </w:p>
+        </w:tc>
+        <w:tc>
+          <w:tcPr>
+            <w:tcW w:type="dxa" w:w="1511"/>
+          </w:tcPr>
+          <w:p>
+            <w:r/>
+            <w:r>
+              <w:rPr>
+                <w:rFonts w:ascii="Times New Roman" w:hAnsi="Times New Roman" w:eastAsia="宋体"/>
+                <w:b w:val="0"/>
+                <w:sz w:val="21"/>
+              </w:rPr>
+              <w:t>0.055</w:t>
+            </w:r>
+          </w:p>
+        </w:tc>
+        <w:tc>
+          <w:tcPr>
+            <w:tcW w:type="dxa" w:w="1511"/>
+          </w:tcPr>
+          <w:p>
+            <w:r/>
+            <w:r>
+              <w:rPr>
+                <w:rFonts w:ascii="Times New Roman" w:hAnsi="Times New Roman" w:eastAsia="宋体"/>
+                <w:b w:val="0"/>
+                <w:sz w:val="21"/>
+              </w:rPr>
+              <w:t>0.214</w:t>
+            </w:r>
+          </w:p>
+        </w:tc>
+        <w:tc>
+          <w:tcPr>
+            <w:tcW w:type="dxa" w:w="1511"/>
+          </w:tcPr>
+          <w:p>
+            <w:r/>
+            <w:r>
+              <w:rPr>
+                <w:rFonts w:ascii="Times New Roman" w:hAnsi="Times New Roman" w:eastAsia="宋体"/>
+                <w:b w:val="0"/>
+                <w:sz w:val="21"/>
+              </w:rPr>
+              <w:t>0.217</w:t>
+            </w:r>
+          </w:p>
+        </w:tc>
+      </w:tr>
+      <w:tr>
+        <w:tc>
+          <w:tcPr>
+            <w:tcW w:type="dxa" w:w="1511"/>
+          </w:tcPr>
+          <w:p>
+            <w:r/>
+            <w:r>
+              <w:rPr>
+                <w:rFonts w:ascii="Times New Roman" w:hAnsi="Times New Roman" w:eastAsia="宋体"/>
+                <w:b w:val="0"/>
+                <w:sz w:val="21"/>
+              </w:rPr>
+              <w:t>未见过（unseen）</w:t>
+            </w:r>
+          </w:p>
+        </w:tc>
+        <w:tc>
+          <w:tcPr>
+            <w:tcW w:type="dxa" w:w="1511"/>
+          </w:tcPr>
+          <w:p>
+            <w:r/>
+            <w:r>
+              <w:rPr>
+                <w:rFonts w:ascii="Times New Roman" w:hAnsi="Times New Roman" w:eastAsia="宋体"/>
+                <w:b w:val="0"/>
+                <w:sz w:val="21"/>
+              </w:rPr>
+              <w:t>923</w:t>
+            </w:r>
+          </w:p>
+        </w:tc>
+        <w:tc>
+          <w:tcPr>
+            <w:tcW w:type="dxa" w:w="1511"/>
+          </w:tcPr>
+          <w:p>
+            <w:r/>
+            <w:r>
+              <w:rPr>
+                <w:rFonts w:ascii="Times New Roman" w:hAnsi="Times New Roman" w:eastAsia="宋体"/>
+                <w:b w:val="0"/>
+                <w:sz w:val="21"/>
+              </w:rPr>
+              <w:t>0.763</w:t>
+            </w:r>
+          </w:p>
+        </w:tc>
+        <w:tc>
+          <w:tcPr>
+            <w:tcW w:type="dxa" w:w="1511"/>
+          </w:tcPr>
+          <w:p>
+            <w:r/>
+            <w:r>
+              <w:rPr>
+                <w:rFonts w:ascii="Times New Roman" w:hAnsi="Times New Roman" w:eastAsia="宋体"/>
+                <w:b w:val="0"/>
+                <w:sz w:val="21"/>
+              </w:rPr>
+              <w:t>0.673</w:t>
+            </w:r>
+          </w:p>
+        </w:tc>
+        <w:tc>
+          <w:tcPr>
+            <w:tcW w:type="dxa" w:w="1511"/>
+          </w:tcPr>
+          <w:p>
+            <w:r/>
+            <w:r>
+              <w:rPr>
+                <w:rFonts w:ascii="Times New Roman" w:hAnsi="Times New Roman" w:eastAsia="宋体"/>
+                <w:b w:val="0"/>
+                <w:sz w:val="21"/>
+              </w:rPr>
+              <w:t>0.801</w:t>
+            </w:r>
+          </w:p>
+        </w:tc>
+        <w:tc>
+          <w:tcPr>
+            <w:tcW w:type="dxa" w:w="1511"/>
+          </w:tcPr>
+          <w:p>
+            <w:r/>
+            <w:r>
+              <w:rPr>
+                <w:rFonts w:ascii="Times New Roman" w:hAnsi="Times New Roman" w:eastAsia="宋体"/>
+                <w:b w:val="0"/>
+                <w:sz w:val="21"/>
+              </w:rPr>
+              <w:t>0.740</w:t>
+            </w:r>
+          </w:p>
+        </w:tc>
+      </w:tr>
+      <w:tr>
+        <w:tc>
+          <w:tcPr>
+            <w:tcW w:type="dxa" w:w="1511"/>
+          </w:tcPr>
+          <w:p>
+            <w:r/>
+            <w:r>
+              <w:rPr>
+                <w:rFonts w:ascii="Times New Roman" w:hAnsi="Times New Roman" w:eastAsia="宋体"/>
+                <w:b w:val="0"/>
+                <w:sz w:val="21"/>
+              </w:rPr>
+              <w:t>参照：清洗后测试集</w:t>
+            </w:r>
+          </w:p>
+        </w:tc>
+        <w:tc>
+          <w:tcPr>
+            <w:tcW w:type="dxa" w:w="1511"/>
+          </w:tcPr>
+          <w:p>
+            <w:r/>
+            <w:r>
+              <w:rPr>
+                <w:rFonts w:ascii="Times New Roman" w:hAnsi="Times New Roman" w:eastAsia="宋体"/>
+                <w:b w:val="0"/>
+                <w:sz w:val="21"/>
+              </w:rPr>
+              <w:t>1713</w:t>
+            </w:r>
+          </w:p>
+        </w:tc>
+        <w:tc>
+          <w:tcPr>
+            <w:tcW w:type="dxa" w:w="1511"/>
+          </w:tcPr>
+          <w:p>
+            <w:r/>
+            <w:r>
+              <w:rPr>
+                <w:rFonts w:ascii="Times New Roman" w:hAnsi="Times New Roman" w:eastAsia="宋体"/>
+                <w:b w:val="0"/>
+                <w:sz w:val="21"/>
+              </w:rPr>
+              <w:t>0.734</w:t>
+            </w:r>
+          </w:p>
+        </w:tc>
+        <w:tc>
+          <w:tcPr>
+            <w:tcW w:type="dxa" w:w="1511"/>
+          </w:tcPr>
+          <w:p>
+            <w:r/>
+            <w:r>
+              <w:rPr>
+                <w:rFonts w:ascii="Times New Roman" w:hAnsi="Times New Roman" w:eastAsia="宋体"/>
+                <w:b w:val="0"/>
+                <w:sz w:val="21"/>
+              </w:rPr>
+              <w:t>0.702</w:t>
+            </w:r>
+          </w:p>
+        </w:tc>
+        <w:tc>
+          <w:tcPr>
+            <w:tcW w:type="dxa" w:w="1511"/>
+          </w:tcPr>
+          <w:p>
+            <w:r/>
+            <w:r>
+              <w:rPr>
+                <w:rFonts w:ascii="Times New Roman" w:hAnsi="Times New Roman" w:eastAsia="宋体"/>
+                <w:b w:val="0"/>
+                <w:sz w:val="21"/>
+              </w:rPr>
+              <w:t>0.802</w:t>
+            </w:r>
+          </w:p>
+        </w:tc>
+        <w:tc>
+          <w:tcPr>
+            <w:tcW w:type="dxa" w:w="1511"/>
+          </w:tcPr>
+          <w:p>
+            <w:r/>
+            <w:r>
+              <w:rPr>
+                <w:rFonts w:ascii="Times New Roman" w:hAnsi="Times New Roman" w:eastAsia="宋体"/>
+                <w:b w:val="0"/>
+                <w:sz w:val="21"/>
+              </w:rPr>
+              <w:t>0.778</w:t>
+            </w:r>
+          </w:p>
+        </w:tc>
+      </w:tr>
+    </w:tbl>
+    <w:p/>
+    <w:p>
+      <w:pPr>
+        <w:spacing w:line="360" w:lineRule="auto" w:after="0"/>
+        <w:ind w:firstLine="480"/>
+      </w:pPr>
+      <w:r>
+        <w:rPr>
+          <w:rFonts w:ascii="Times New Roman" w:hAnsi="Times New Roman" w:eastAsia="宋体"/>
+          <w:b w:val="0"/>
+          <w:sz w:val="24"/>
+        </w:rPr>
+        <w:t>结果揭示了泄露的三个影响：</w:t>
+      </w:r>
+    </w:p>
+    <w:p>
+      <w:pPr>
+        <w:spacing w:line="360" w:lineRule="auto" w:after="0"/>
+        <w:ind w:firstLine="480"/>
+      </w:pPr>
+      <w:r>
+        <w:rPr>
+          <w:rFonts w:ascii="Times New Roman" w:hAnsi="Times New Roman" w:eastAsia="宋体"/>
+          <w:b w:val="0"/>
+          <w:sz w:val="24"/>
+        </w:rPr>
+        <w:t>第一，模型会“背答案”。对训练中见过的原句，TF-IDF 的准确率高达 96.8%，RoBERTa 为 92.6%，远高于未见过样本上的 76.3% 和 80.1%；而对训练中标签不同的 229 条样本，两个模型的准确率只有 5.2% 和 21.4%，说明它们基本是在复现训练中记住的标签。</w:t>
+      </w:r>
+    </w:p>
+    <w:p>
+      <w:pPr>
+        <w:spacing w:line="360" w:lineRule="auto" w:after="0"/>
+        <w:ind w:firstLine="480"/>
+      </w:pPr>
+      <w:r>
+        <w:rPr>
+          <w:rFonts w:ascii="Times New Roman" w:hAnsi="Times New Roman" w:eastAsia="宋体"/>
+          <w:b w:val="0"/>
+          <w:sz w:val="24"/>
+        </w:rPr>
+        <w:t>第二，泄露使分数偏离模型真实的泛化能力，偏离程度因模型而异。以未见过样本上的 Macro-F1 作为真实泛化能力的估计，TF-IDF 在全部测试集上的分数虚高了 8.1 个百分点（0.755 对 0.673），RoBERTa 虚高了 3.3 个百分点（0.773 对 0.740）。依赖词面匹配的 TF-IDF 更善于记忆原句，受益更多。</w:t>
+      </w:r>
+    </w:p>
+    <w:p>
+      <w:pPr>
+        <w:spacing w:line="360" w:lineRule="auto" w:after="0"/>
+        <w:ind w:firstLine="480"/>
+      </w:pPr>
+      <w:r>
+        <w:rPr>
+          <w:rFonts w:ascii="Times New Roman" w:hAnsi="Times New Roman" w:eastAsia="宋体"/>
+          <w:b w:val="0"/>
+          <w:sz w:val="24"/>
+        </w:rPr>
+        <w:t>第三，泄露会扭曲模型之间的比较。在未清洗的全部测试集上，RoBERTa 只比 TF-IDF 高 1.9 个百分点；但在未见过的样本上，两者差距为 6.7 个百分点，在清洗后的测试集上为 7.7 个百分点。也就是说，泄露把两类模型的真实差距缩小了约三分之二，可能导致研究者低估更强模型的优势。</w:t>
+      </w:r>
+    </w:p>
+    <w:p>
+      <w:pPr>
+        <w:spacing w:line="360" w:lineRule="auto" w:after="0"/>
+        <w:ind w:firstLine="480"/>
+      </w:pPr>
+      <w:r>
+        <w:rPr>
+          <w:rFonts w:ascii="Times New Roman" w:hAnsi="Times New Roman" w:eastAsia="宋体"/>
+          <w:b w:val="0"/>
+          <w:sz w:val="24"/>
+        </w:rPr>
+        <w:t>此外，比较两种训练方式在“未见过”文本上的表现：未清洗数据训练的 RoBERTa 在 923 条未见过样本上的 Macro-F1 为 0.740，清洗后数据训练的 RoBERTa 在其中同时属于清洗后测试集的 845 条样本上为 0.739，两者基本持平（两个子集大部分重合但不完全相同，此比较为近似）。这说明清洗虽然删除了部分训练样本，但没有明显损害模型的泛化能力。</w:t>
+      </w:r>
+    </w:p>
+    <w:p>
+      <w:pPr>
+        <w:spacing w:before="240" w:after="120"/>
+      </w:pPr>
+      <w:r>
+        <w:rPr>
+          <w:rFonts w:ascii="Times New Roman" w:hAnsi="Times New Roman" w:eastAsia="黑体"/>
+          <w:b/>
+          <w:sz w:val="28"/>
+        </w:rPr>
+        <w:t>4.7 标注噪声与准确率上限</w:t>
+      </w:r>
+    </w:p>
+    <w:p>
+      <w:pPr>
+        <w:spacing w:line="360" w:lineRule="auto" w:after="0"/>
+        <w:ind w:firstLine="480"/>
+      </w:pPr>
+      <w:r>
+        <w:rPr>
+          <w:rFonts w:ascii="Times New Roman" w:hAnsi="Times New Roman" w:eastAsia="宋体"/>
+          <w:b w:val="0"/>
+          <w:sz w:val="24"/>
+        </w:rPr>
+        <w:t>FinFE 中有 5575 条文本被标注了两次及以上，共形成 6048 对“同一文本的两次标注”。本文以这些配对估计标注的一致性，结果见表 4-10。</w:t>
+      </w:r>
+    </w:p>
+    <w:p>
+      <w:pPr>
+        <w:spacing w:line="360" w:lineRule="auto" w:after="0"/>
+        <w:jc w:val="center"/>
+      </w:pPr>
+      <w:r>
+        <w:rPr>
+          <w:rFonts w:ascii="Times New Roman" w:hAnsi="Times New Roman" w:eastAsia="宋体"/>
+          <w:b w:val="0"/>
+          <w:sz w:val="21"/>
+        </w:rPr>
+        <w:t>表 4-10 重复标注的一致性分析</w:t>
+      </w:r>
+    </w:p>
+    <w:tbl>
+      <w:tblPr>
+        <w:tblW w:type="auto" w:w="0"/>
+        <w:tblLook w:firstColumn="1" w:firstRow="1" w:lastColumn="0" w:lastRow="0" w:noHBand="0" w:noVBand="1" w:val="04A0"/>
+        <w:jc w:val="center"/>
+        <w:tblBorders>
+          <w:top w:val="single" w:sz="4"/>
+          <w:left w:val="single" w:sz="4"/>
+          <w:bottom w:val="single" w:sz="4"/>
+          <w:right w:val="single" w:sz="4"/>
+          <w:insideH w:val="single" w:sz="4"/>
+          <w:insideV w:val="single" w:sz="4"/>
+        </w:tblBorders>
+      </w:tblPr>
+      <w:tblGrid>
+        <w:gridCol w:w="4533"/>
+        <w:gridCol w:w="4533"/>
+      </w:tblGrid>
+      <w:tr>
+        <w:tc>
+          <w:tcPr>
+            <w:tcW w:type="dxa" w:w="4533"/>
+          </w:tcPr>
+          <w:p>
+            <w:pPr>
+              <w:jc w:val="center"/>
+            </w:pPr>
+            <w:r/>
+            <w:r>
+              <w:rPr>
+                <w:rFonts w:ascii="Times New Roman" w:hAnsi="Times New Roman" w:eastAsia="黑体"/>
+                <w:b w:val="0"/>
+                <w:sz w:val="21"/>
+              </w:rPr>
+              <w:t>指标</w:t>
+            </w:r>
+          </w:p>
+        </w:tc>
+        <w:tc>
+          <w:tcPr>
+            <w:tcW w:type="dxa" w:w="4533"/>
+          </w:tcPr>
+          <w:p>
+            <w:pPr>
+              <w:jc w:val="center"/>
+            </w:pPr>
+            <w:r/>
+            <w:r>
+              <w:rPr>
+                <w:rFonts w:ascii="Times New Roman" w:hAnsi="Times New Roman" w:eastAsia="黑体"/>
+                <w:b w:val="0"/>
+                <w:sz w:val="21"/>
+              </w:rPr>
+              <w:t>数值</w:t>
+            </w:r>
+          </w:p>
+        </w:tc>
+      </w:tr>
+      <w:tr>
+        <w:tc>
+          <w:tcPr>
+            <w:tcW w:type="dxa" w:w="4533"/>
+          </w:tcPr>
+          <w:p>
+            <w:r/>
+            <w:r>
+              <w:rPr>
+                <w:rFonts w:ascii="Times New Roman" w:hAnsi="Times New Roman" w:eastAsia="宋体"/>
+                <w:b w:val="0"/>
+                <w:sz w:val="21"/>
+              </w:rPr>
+              <w:t>被重复标注的文本数 / 标注配对数</w:t>
+            </w:r>
+          </w:p>
+        </w:tc>
+        <w:tc>
+          <w:tcPr>
+            <w:tcW w:type="dxa" w:w="4533"/>
+          </w:tcPr>
+          <w:p>
+            <w:r/>
+            <w:r>
+              <w:rPr>
+                <w:rFonts w:ascii="Times New Roman" w:hAnsi="Times New Roman" w:eastAsia="宋体"/>
+                <w:b w:val="0"/>
+                <w:sz w:val="21"/>
+              </w:rPr>
+              <w:t>5575 / 6048</w:t>
+            </w:r>
+          </w:p>
+        </w:tc>
+      </w:tr>
+      <w:tr>
+        <w:tc>
+          <w:tcPr>
+            <w:tcW w:type="dxa" w:w="4533"/>
+          </w:tcPr>
+          <w:p>
+            <w:r/>
+            <w:r>
+              <w:rPr>
+                <w:rFonts w:ascii="Times New Roman" w:hAnsi="Times New Roman" w:eastAsia="宋体"/>
+                <w:b w:val="0"/>
+                <w:sz w:val="21"/>
+              </w:rPr>
+              <w:t>两次标注一致率 p</w:t>
+            </w:r>
+          </w:p>
+        </w:tc>
+        <w:tc>
+          <w:tcPr>
+            <w:tcW w:type="dxa" w:w="4533"/>
+          </w:tcPr>
+          <w:p>
+            <w:r/>
+            <w:r>
+              <w:rPr>
+                <w:rFonts w:ascii="Times New Roman" w:hAnsi="Times New Roman" w:eastAsia="宋体"/>
+                <w:b w:val="0"/>
+                <w:sz w:val="21"/>
+              </w:rPr>
+              <w:t>0.829（95% CI：0.814～0.845）</w:t>
+            </w:r>
+          </w:p>
+        </w:tc>
+      </w:tr>
+      <w:tr>
+        <w:tc>
+          <w:tcPr>
+            <w:tcW w:type="dxa" w:w="4533"/>
+          </w:tcPr>
+          <w:p>
+            <w:r/>
+            <w:r>
+              <w:rPr>
+                <w:rFonts w:ascii="Times New Roman" w:hAnsi="Times New Roman" w:eastAsia="宋体"/>
+                <w:b w:val="0"/>
+                <w:sz w:val="21"/>
+              </w:rPr>
+              <w:t>随机一致率 p_e（按类别比例）</w:t>
+            </w:r>
+          </w:p>
+        </w:tc>
+        <w:tc>
+          <w:tcPr>
+            <w:tcW w:type="dxa" w:w="4533"/>
+          </w:tcPr>
+          <w:p>
+            <w:r/>
+            <w:r>
+              <w:rPr>
+                <w:rFonts w:ascii="Times New Roman" w:hAnsi="Times New Roman" w:eastAsia="宋体"/>
+                <w:b w:val="0"/>
+                <w:sz w:val="21"/>
+              </w:rPr>
+              <w:t>0.355</w:t>
+            </w:r>
+          </w:p>
+        </w:tc>
+      </w:tr>
+      <w:tr>
+        <w:tc>
+          <w:tcPr>
+            <w:tcW w:type="dxa" w:w="4533"/>
+          </w:tcPr>
+          <w:p>
+            <w:r/>
+            <w:r>
+              <w:rPr>
+                <w:rFonts w:ascii="Times New Roman" w:hAnsi="Times New Roman" w:eastAsia="宋体"/>
+                <w:b w:val="0"/>
+                <w:sz w:val="21"/>
+              </w:rPr>
+              <w:t>机会校正一致率 κ</w:t>
+            </w:r>
+          </w:p>
+        </w:tc>
+        <w:tc>
+          <w:tcPr>
+            <w:tcW w:type="dxa" w:w="4533"/>
+          </w:tcPr>
+          <w:p>
+            <w:r/>
+            <w:r>
+              <w:rPr>
+                <w:rFonts w:ascii="Times New Roman" w:hAnsi="Times New Roman" w:eastAsia="宋体"/>
+                <w:b w:val="0"/>
+                <w:sz w:val="21"/>
+              </w:rPr>
+              <w:t>0.735</w:t>
+            </w:r>
+          </w:p>
+        </w:tc>
+      </w:tr>
+      <w:tr>
+        <w:tc>
+          <w:tcPr>
+            <w:tcW w:type="dxa" w:w="4533"/>
+          </w:tcPr>
+          <w:p>
+            <w:r/>
+            <w:r>
+              <w:rPr>
+                <w:rFonts w:ascii="Times New Roman" w:hAnsi="Times New Roman" w:eastAsia="宋体"/>
+                <w:b w:val="0"/>
+                <w:sz w:val="21"/>
+              </w:rPr>
+              <w:t>估计的单次标注正确率 q</w:t>
+            </w:r>
+          </w:p>
+        </w:tc>
+        <w:tc>
+          <w:tcPr>
+            <w:tcW w:type="dxa" w:w="4533"/>
+          </w:tcPr>
+          <w:p>
+            <w:r/>
+            <w:r>
+              <w:rPr>
+                <w:rFonts w:ascii="Times New Roman" w:hAnsi="Times New Roman" w:eastAsia="宋体"/>
+                <w:b w:val="0"/>
+                <w:sz w:val="21"/>
+              </w:rPr>
+              <w:t>0.908（95% CI：0.899～0.918）</w:t>
+            </w:r>
+          </w:p>
+        </w:tc>
+      </w:tr>
+      <w:tr>
+        <w:tc>
+          <w:tcPr>
+            <w:tcW w:type="dxa" w:w="4533"/>
+          </w:tcPr>
+          <w:p>
+            <w:r/>
+            <w:r>
+              <w:rPr>
+                <w:rFonts w:ascii="Times New Roman" w:hAnsi="Times New Roman" w:eastAsia="宋体"/>
+                <w:b w:val="0"/>
+                <w:sz w:val="21"/>
+              </w:rPr>
+              <w:t>冲突配对中：消极—中性 / 中性—积极 / 消极—积极</w:t>
+            </w:r>
+          </w:p>
+        </w:tc>
+        <w:tc>
+          <w:tcPr>
+            <w:tcW w:type="dxa" w:w="4533"/>
+          </w:tcPr>
+          <w:p>
+            <w:r/>
+            <w:r>
+              <w:rPr>
+                <w:rFonts w:ascii="Times New Roman" w:hAnsi="Times New Roman" w:eastAsia="宋体"/>
+                <w:b w:val="0"/>
+                <w:sz w:val="21"/>
+              </w:rPr>
+              <w:t>475 / 374 / 186</w:t>
+            </w:r>
+          </w:p>
+        </w:tc>
+      </w:tr>
+    </w:tbl>
+    <w:p/>
+    <w:p>
+      <w:pPr>
+        <w:spacing w:line="360" w:lineRule="auto" w:after="0"/>
+        <w:ind w:firstLine="480"/>
+      </w:pPr>
+      <w:r>
+        <w:rPr>
+          <w:rFonts w:ascii="Times New Roman" w:hAnsi="Times New Roman" w:eastAsia="宋体"/>
+          <w:b w:val="0"/>
+          <w:sz w:val="24"/>
+        </w:rPr>
+        <w:t>同一条文本的两次标注只有 82.9% 是一致的，机会校正后的 κ 为 0.735，按常用标准属于“较高但不完全”的一致性。假设每次标注以概率 q 给出真实标签、否则等可能地给出另外两类之一，则两次标注一致的概率为 p = q² + (1 − q)²/2，解得 q = [1 + √(6p − 2)]/3 ≈ 0.908。这意味着，即使一个模型能完全预测出真实情感，它与数据集标签的一致率也只有约 91%，可以把 91% 看作该数据集上准确率的近似上限。</w:t>
+      </w:r>
+    </w:p>
+    <w:p>
+      <w:pPr>
+        <w:spacing w:line="360" w:lineRule="auto" w:after="0"/>
+        <w:ind w:firstLine="480"/>
+      </w:pPr>
+      <w:r>
+        <w:rPr>
+          <w:rFonts w:ascii="Times New Roman" w:hAnsi="Times New Roman" w:eastAsia="宋体"/>
+          <w:b w:val="0"/>
+          <w:sz w:val="24"/>
+        </w:rPr>
+        <w:t>这一分析有三点启示：</w:t>
+      </w:r>
+    </w:p>
+    <w:p>
+      <w:pPr>
+        <w:spacing w:line="360" w:lineRule="auto" w:after="0"/>
+        <w:ind w:firstLine="480"/>
+      </w:pPr>
+      <w:r>
+        <w:rPr>
+          <w:rFonts w:ascii="Times New Roman" w:hAnsi="Times New Roman" w:eastAsia="宋体"/>
+          <w:b w:val="0"/>
+          <w:sz w:val="24"/>
+        </w:rPr>
+        <w:t>1. 本文最好的模型准确率约为 82%，距离约 91% 的上限仍有约 9 个百分点的空间，模型仍有改进余地；</w:t>
+      </w:r>
+    </w:p>
+    <w:p>
+      <w:pPr>
+        <w:spacing w:line="360" w:lineRule="auto" w:after="0"/>
+        <w:ind w:firstLine="480"/>
+      </w:pPr>
+      <w:r>
+        <w:rPr>
+          <w:rFonts w:ascii="Times New Roman" w:hAnsi="Times New Roman" w:eastAsia="宋体"/>
+          <w:b w:val="0"/>
+          <w:sz w:val="24"/>
+        </w:rPr>
+        <w:t>2. 值得注意的是，LoRA 大模型与数据标签的一致率（约 82%）已与两次人工标注之间的一致率（82.9%）相当，即模型与标注者的一致程度已接近标注者与标注者之间的一致程度；</w:t>
+      </w:r>
+    </w:p>
+    <w:p>
+      <w:pPr>
+        <w:spacing w:line="360" w:lineRule="auto" w:after="0"/>
+        <w:ind w:firstLine="480"/>
+      </w:pPr>
+      <w:r>
+        <w:rPr>
+          <w:rFonts w:ascii="Times New Roman" w:hAnsi="Times New Roman" w:eastAsia="宋体"/>
+          <w:b w:val="0"/>
+          <w:sz w:val="24"/>
+        </w:rPr>
+        <w:t>3. 在全部 1035 个冲突配对中，有 849 个（82%）涉及中性类，这从数据层面解释了 4.1 节中各模型在中性类上表现最差的现象：中性类的边界本身就存在较大的主观分歧。</w:t>
+      </w:r>
+    </w:p>
+    <w:p>
+      <w:pPr>
+        <w:spacing w:line="360" w:lineRule="auto" w:after="0"/>
+        <w:ind w:firstLine="480"/>
+      </w:pPr>
+      <w:r>
+        <w:rPr>
+          <w:rFonts w:ascii="Times New Roman" w:hAnsi="Times New Roman" w:eastAsia="宋体"/>
+          <w:b w:val="0"/>
+          <w:sz w:val="24"/>
+        </w:rPr>
+        <w:t>需要说明的是，被重复标注的文本平均长度（18.5 个字符）略短于全部文本（21.1 个字符），并非完全随机的样本，且上述噪声模型假设各类错误等可能发生，因此 91% 的上限应视为粗略估计。</w:t>
+      </w:r>
+    </w:p>
+    <w:p>
+      <w:pPr>
+        <w:spacing w:before="240" w:after="120"/>
+      </w:pPr>
+      <w:r>
+        <w:rPr>
+          <w:rFonts w:ascii="Times New Roman" w:hAnsi="Times New Roman" w:eastAsia="黑体"/>
+          <w:b/>
+          <w:sz w:val="28"/>
+        </w:rPr>
+        <w:t>4.8 本章小结</w:t>
+      </w:r>
+    </w:p>
+    <w:p>
+      <w:pPr>
+        <w:spacing w:line="360" w:lineRule="auto" w:after="0"/>
+        <w:ind w:firstLine="480"/>
+      </w:pPr>
+      <w:r>
+        <w:rPr>
+          <w:rFonts w:ascii="Times New Roman" w:hAnsi="Times New Roman" w:eastAsia="宋体"/>
+          <w:b w:val="0"/>
+          <w:sz w:val="24"/>
+        </w:rPr>
+        <w:t>本章从分类效果、统计显著性、校准、选择性预测和数据质量五个方面对实验结果进行了分析，主要结论如下：</w:t>
       </w:r>
     </w:p>
     <w:p>
@@ -11902,7 +13032,35 @@
           <w:b w:val="0"/>
           <w:sz w:val="24"/>
         </w:rPr>
-        <w:t>6. 中性类是所有模型的共同难点，这与中性评论本身语义模糊、标注存在分歧有关。</w:t>
+        <w:t>6. 中性类是所有模型的共同难点：重复标注中 82% 的冲突涉及中性类，说明其边界本身存在主观分歧。</w:t>
+      </w:r>
+    </w:p>
+    <w:p>
+      <w:pPr>
+        <w:spacing w:line="360" w:lineRule="auto" w:after="0"/>
+        <w:ind w:firstLine="480"/>
+      </w:pPr>
+      <w:r>
+        <w:rPr>
+          <w:rFonts w:ascii="Times New Roman" w:hAnsi="Times New Roman" w:eastAsia="宋体"/>
+          <w:b w:val="0"/>
+          <w:sz w:val="24"/>
+        </w:rPr>
+        <w:t>7. 数据泄露会让模型“背答案”，使 TF-IDF 的分数虚高 8.1 个百分点，并把 TF-IDF 与 RoBERTa 的真实差距缩小约三分之二；清洗数据没有明显损害模型的泛化能力。</w:t>
+      </w:r>
+    </w:p>
+    <w:p>
+      <w:pPr>
+        <w:spacing w:line="360" w:lineRule="auto" w:after="0"/>
+        <w:ind w:firstLine="480"/>
+      </w:pPr>
+      <w:r>
+        <w:rPr>
+          <w:rFonts w:ascii="Times New Roman" w:hAnsi="Times New Roman" w:eastAsia="宋体"/>
+          <w:b w:val="0"/>
+          <w:sz w:val="24"/>
+        </w:rPr>
+        <w:t>8. 重复标注的一致率仅为 82.9%（κ = 0.735），据此估计该数据集的准确率上限约为 91%；LoRA 大模型与标签的一致率已接近人工标注之间的一致率。</w:t>
       </w:r>
     </w:p>
     <w:p>

</xml_diff>

<commit_message>
docs: fix 4 rounding/consistency errors found by number check; sync conformal table; README progress
</commit_message>
<xml_diff>
--- a/docs/thesis-ch3-ch4.docx
+++ b/docs/thesis-ch3-ch4.docx
@@ -3889,7 +3889,7 @@
                 <w:b w:val="0"/>
                 <w:sz w:val="21"/>
               </w:rPr>
-              <w:t>0.631</w:t>
+              <w:t>0.630</w:t>
             </w:r>
           </w:p>
         </w:tc>
@@ -10410,7 +10410,7 @@
                 <w:b w:val="0"/>
                 <w:sz w:val="21"/>
               </w:rPr>
-              <w:t>0.883</w:t>
+              <w:t>0.882</w:t>
             </w:r>
           </w:p>
         </w:tc>
@@ -12148,7 +12148,7 @@
                 <w:b w:val="0"/>
                 <w:sz w:val="21"/>
               </w:rPr>
-              <w:t>0.926</w:t>
+              <w:t>0.925</w:t>
             </w:r>
           </w:p>
         </w:tc>
@@ -12490,7 +12490,7 @@
           <w:b w:val="0"/>
           <w:sz w:val="24"/>
         </w:rPr>
-        <w:t>第一，模型会“背答案”。对训练中见过的原句，TF-IDF 的准确率高达 96.8%，RoBERTa 为 92.6%，远高于未见过样本上的 76.3% 和 80.1%；而对训练中标签不同的 229 条样本，两个模型的准确率只有 5.2% 和 21.4%，说明它们基本是在复现训练中记住的标签。</w:t>
+        <w:t>第一，模型会“背答案”。对训练中见过的原句，TF-IDF 的准确率高达 96.8%，RoBERTa 为 92.5%，远高于未见过样本上的 76.3% 和 80.1%；而对训练中标签不同的 229 条样本，两个模型的准确率只有 5.2% 和 21.4%，说明它们基本是在复现训练中记住的标签。</w:t>
       </w:r>
     </w:p>
     <w:p>
@@ -13868,7 +13868,7 @@
                 <w:b w:val="0"/>
                 <w:sz w:val="21"/>
               </w:rPr>
-              <w:t>1.249</w:t>
+              <w:t>1.247</w:t>
             </w:r>
           </w:p>
         </w:tc>
@@ -13884,7 +13884,7 @@
                 <w:b w:val="0"/>
                 <w:sz w:val="21"/>
               </w:rPr>
-              <w:t>77.8%</w:t>
+              <w:t>77.9%</w:t>
             </w:r>
           </w:p>
         </w:tc>
@@ -13916,7 +13916,7 @@
                 <w:b w:val="0"/>
                 <w:sz w:val="21"/>
               </w:rPr>
-              <w:t>0.777</w:t>
+              <w:t>0.776</w:t>
             </w:r>
           </w:p>
         </w:tc>
@@ -13982,7 +13982,7 @@
                 <w:b w:val="0"/>
                 <w:sz w:val="21"/>
               </w:rPr>
-              <w:t>0.902</w:t>
+              <w:t>0.901</w:t>
             </w:r>
           </w:p>
         </w:tc>
@@ -14030,7 +14030,7 @@
                 <w:b w:val="0"/>
                 <w:sz w:val="21"/>
               </w:rPr>
-              <w:t>0.902</w:t>
+              <w:t>0.901</w:t>
             </w:r>
           </w:p>
         </w:tc>
@@ -14062,7 +14062,7 @@
                 <w:b w:val="0"/>
                 <w:sz w:val="21"/>
               </w:rPr>
-              <w:t>0.902</w:t>
+              <w:t>0.900</w:t>
             </w:r>
           </w:p>
         </w:tc>
@@ -14112,7 +14112,7 @@
                 <w:b w:val="0"/>
                 <w:sz w:val="21"/>
               </w:rPr>
-              <w:t>0.902</w:t>
+              <w:t>0.901</w:t>
             </w:r>
           </w:p>
         </w:tc>
@@ -14128,7 +14128,7 @@
                 <w:b w:val="0"/>
                 <w:sz w:val="21"/>
               </w:rPr>
-              <w:t>1.250</w:t>
+              <w:t>1.248</w:t>
             </w:r>
           </w:p>
         </w:tc>
@@ -14144,7 +14144,7 @@
                 <w:b w:val="0"/>
                 <w:sz w:val="21"/>
               </w:rPr>
-              <w:t>76.9%</w:t>
+              <w:t>77.1%</w:t>
             </w:r>
           </w:p>
         </w:tc>
@@ -14176,7 +14176,7 @@
                 <w:b w:val="0"/>
                 <w:sz w:val="21"/>
               </w:rPr>
-              <w:t>0.759</w:t>
+              <w:t>0.758</w:t>
             </w:r>
           </w:p>
         </w:tc>
@@ -14192,7 +14192,7 @@
                 <w:b w:val="0"/>
                 <w:sz w:val="21"/>
               </w:rPr>
-              <w:t>0.961</w:t>
+              <w:t>0.960</w:t>
             </w:r>
           </w:p>
         </w:tc>
@@ -14258,7 +14258,7 @@
                 <w:b w:val="0"/>
                 <w:sz w:val="21"/>
               </w:rPr>
-              <w:t>1.285</w:t>
+              <w:t>1.288</w:t>
             </w:r>
           </w:p>
         </w:tc>
@@ -14274,7 +14274,7 @@
                 <w:b w:val="0"/>
                 <w:sz w:val="21"/>
               </w:rPr>
-              <w:t>72.5%</w:t>
+              <w:t>72.3%</w:t>
             </w:r>
           </w:p>
         </w:tc>
@@ -14290,7 +14290,7 @@
                 <w:b w:val="0"/>
                 <w:sz w:val="21"/>
               </w:rPr>
-              <w:t>0.903</w:t>
+              <w:t>0.902</w:t>
             </w:r>
           </w:p>
         </w:tc>
@@ -14306,23 +14306,23 @@
                 <w:b w:val="0"/>
                 <w:sz w:val="21"/>
               </w:rPr>
+              <w:t>0.904</w:t>
+            </w:r>
+          </w:p>
+        </w:tc>
+        <w:tc>
+          <w:tcPr>
+            <w:tcW w:type="dxa" w:w="1133"/>
+          </w:tcPr>
+          <w:p>
+            <w:r/>
+            <w:r>
+              <w:rPr>
+                <w:rFonts w:ascii="Times New Roman" w:hAnsi="Times New Roman" w:eastAsia="宋体"/>
+                <w:b w:val="0"/>
+                <w:sz w:val="21"/>
+              </w:rPr>
               <w:t>0.902</w:t>
-            </w:r>
-          </w:p>
-        </w:tc>
-        <w:tc>
-          <w:tcPr>
-            <w:tcW w:type="dxa" w:w="1133"/>
-          </w:tcPr>
-          <w:p>
-            <w:r/>
-            <w:r>
-              <w:rPr>
-                <w:rFonts w:ascii="Times New Roman" w:hAnsi="Times New Roman" w:eastAsia="宋体"/>
-                <w:b w:val="0"/>
-                <w:sz w:val="21"/>
-              </w:rPr>
-              <w:t>0.901</w:t>
             </w:r>
           </w:p>
         </w:tc>
@@ -14388,7 +14388,7 @@
                 <w:b w:val="0"/>
                 <w:sz w:val="21"/>
               </w:rPr>
-              <w:t>1.246</w:t>
+              <w:t>1.247</w:t>
             </w:r>
           </w:p>
         </w:tc>
@@ -14404,7 +14404,7 @@
                 <w:b w:val="0"/>
                 <w:sz w:val="21"/>
               </w:rPr>
-              <w:t>77.8%</w:t>
+              <w:t>77.7%</w:t>
             </w:r>
           </w:p>
         </w:tc>
@@ -14436,7 +14436,7 @@
                 <w:b w:val="0"/>
                 <w:sz w:val="21"/>
               </w:rPr>
-              <w:t>0.805</w:t>
+              <w:t>0.804</w:t>
             </w:r>
           </w:p>
         </w:tc>
@@ -14452,7 +14452,7 @@
                 <w:b w:val="0"/>
                 <w:sz w:val="21"/>
               </w:rPr>
-              <w:t>0.955</w:t>
+              <w:t>0.956</w:t>
             </w:r>
           </w:p>
         </w:tc>
@@ -14502,6 +14502,70 @@
                 <w:b w:val="0"/>
                 <w:sz w:val="21"/>
               </w:rPr>
+              <w:t>0.901</w:t>
+            </w:r>
+          </w:p>
+        </w:tc>
+        <w:tc>
+          <w:tcPr>
+            <w:tcW w:type="dxa" w:w="1133"/>
+          </w:tcPr>
+          <w:p>
+            <w:r/>
+            <w:r>
+              <w:rPr>
+                <w:rFonts w:ascii="Times New Roman" w:hAnsi="Times New Roman" w:eastAsia="宋体"/>
+                <w:b w:val="0"/>
+                <w:sz w:val="21"/>
+              </w:rPr>
+              <w:t>1.316</w:t>
+            </w:r>
+          </w:p>
+        </w:tc>
+        <w:tc>
+          <w:tcPr>
+            <w:tcW w:type="dxa" w:w="1133"/>
+          </w:tcPr>
+          <w:p>
+            <w:r/>
+            <w:r>
+              <w:rPr>
+                <w:rFonts w:ascii="Times New Roman" w:hAnsi="Times New Roman" w:eastAsia="宋体"/>
+                <w:b w:val="0"/>
+                <w:sz w:val="21"/>
+              </w:rPr>
+              <w:t>70.1%</w:t>
+            </w:r>
+          </w:p>
+        </w:tc>
+        <w:tc>
+          <w:tcPr>
+            <w:tcW w:type="dxa" w:w="1133"/>
+          </w:tcPr>
+          <w:p>
+            <w:r/>
+            <w:r>
+              <w:rPr>
+                <w:rFonts w:ascii="Times New Roman" w:hAnsi="Times New Roman" w:eastAsia="宋体"/>
+                <w:b w:val="0"/>
+                <w:sz w:val="21"/>
+              </w:rPr>
+              <w:t>0.903</w:t>
+            </w:r>
+          </w:p>
+        </w:tc>
+        <w:tc>
+          <w:tcPr>
+            <w:tcW w:type="dxa" w:w="1133"/>
+          </w:tcPr>
+          <w:p>
+            <w:r/>
+            <w:r>
+              <w:rPr>
+                <w:rFonts w:ascii="Times New Roman" w:hAnsi="Times New Roman" w:eastAsia="宋体"/>
+                <w:b w:val="0"/>
+                <w:sz w:val="21"/>
+              </w:rPr>
               <w:t>0.902</w:t>
             </w:r>
           </w:p>
@@ -14518,71 +14582,7 @@
                 <w:b w:val="0"/>
                 <w:sz w:val="21"/>
               </w:rPr>
-              <w:t>1.319</w:t>
-            </w:r>
-          </w:p>
-        </w:tc>
-        <w:tc>
-          <w:tcPr>
-            <w:tcW w:type="dxa" w:w="1133"/>
-          </w:tcPr>
-          <w:p>
-            <w:r/>
-            <w:r>
-              <w:rPr>
-                <w:rFonts w:ascii="Times New Roman" w:hAnsi="Times New Roman" w:eastAsia="宋体"/>
-                <w:b w:val="0"/>
-                <w:sz w:val="21"/>
-              </w:rPr>
-              <w:t>69.9%</w:t>
-            </w:r>
-          </w:p>
-        </w:tc>
-        <w:tc>
-          <w:tcPr>
-            <w:tcW w:type="dxa" w:w="1133"/>
-          </w:tcPr>
-          <w:p>
-            <w:r/>
-            <w:r>
-              <w:rPr>
-                <w:rFonts w:ascii="Times New Roman" w:hAnsi="Times New Roman" w:eastAsia="宋体"/>
-                <w:b w:val="0"/>
-                <w:sz w:val="21"/>
-              </w:rPr>
-              <w:t>0.903</w:t>
-            </w:r>
-          </w:p>
-        </w:tc>
-        <w:tc>
-          <w:tcPr>
-            <w:tcW w:type="dxa" w:w="1133"/>
-          </w:tcPr>
-          <w:p>
-            <w:r/>
-            <w:r>
-              <w:rPr>
-                <w:rFonts w:ascii="Times New Roman" w:hAnsi="Times New Roman" w:eastAsia="宋体"/>
-                <w:b w:val="0"/>
-                <w:sz w:val="21"/>
-              </w:rPr>
-              <w:t>0.904</w:t>
-            </w:r>
-          </w:p>
-        </w:tc>
-        <w:tc>
-          <w:tcPr>
-            <w:tcW w:type="dxa" w:w="1133"/>
-          </w:tcPr>
-          <w:p>
-            <w:r/>
-            <w:r>
-              <w:rPr>
-                <w:rFonts w:ascii="Times New Roman" w:hAnsi="Times New Roman" w:eastAsia="宋体"/>
-                <w:b w:val="0"/>
-                <w:sz w:val="21"/>
-              </w:rPr>
-              <w:t>0.900</w:t>
+              <w:t>0.901</w:t>
             </w:r>
           </w:p>
         </w:tc>
@@ -14656,7 +14656,7 @@
           <w:b w:val="0"/>
           <w:sz w:val="24"/>
         </w:rPr>
-        <w:t>第三，标准做法只保证整体覆盖率，中性类的覆盖率明显偏低。在标准做法下，各模型中性类的覆盖率只有 0.76～0.81，而积极类高达 0.96，说明整体 90% 的保证是靠“容易的类别多覆盖、难的类别少覆盖”换来的。按类别校准后，三类的覆盖率都达到 0.90，代价只是平均集合大小增加 0.03～0.08。对于舆情监测等不希望系统性漏判某一类情绪的场景，按类别校准更为合适。这一结果也与 4.7 节“中性类标注分歧最大”的发现相互印证。</w:t>
+        <w:t>第三，标准做法只保证整体覆盖率，中性类的覆盖率明显偏低。在标准做法下，各模型中性类的覆盖率只有 0.76～0.80，而积极类高达 0.96，说明整体 90% 的保证是靠“容易的类别多覆盖、难的类别少覆盖”换来的。按类别校准后，三类的覆盖率都达到 0.90，代价只是平均集合大小增加 0.03～0.08。对于舆情监测等不希望系统性漏判某一类情绪的场景，按类别校准更为合适。这一结果也与 4.7 节“中性类标注分歧最大”的发现相互印证。</w:t>
       </w:r>
     </w:p>
     <w:p>
@@ -14823,7 +14823,7 @@
           <w:b w:val="0"/>
           <w:sz w:val="24"/>
         </w:rPr>
-        <w:t>9. 保形预测在所有模型上都达到了目标覆盖率；LoRA 大模型的预测集合最小，约 78% 的评论可给出有 90% 保证的唯一类别。标准做法下中性类覆盖率只有 0.76～0.81，按类别校准可使三类覆盖率均达到 90%，代价很小。</w:t>
+        <w:t>9. 保形预测在所有模型上都达到了目标覆盖率；LoRA 大模型的预测集合最小，约 78% 的评论可给出有 90% 保证的唯一类别。标准做法下中性类覆盖率只有 0.76～0.80，按类别校准可使三类覆盖率均达到 90%，代价很小。</w:t>
       </w:r>
     </w:p>
     <w:p>

</xml_diff>